<commit_message>
Deploy Kelas 6 Math Game (Master Pecahan KPK & FPB) and Multigrade Worksheets
</commit_message>
<xml_diff>
--- a/math/Bahan_Ajar_KPK_FPB_Multigrade.docx
+++ b/math/Bahan_Ajar_KPK_FPB_Multigrade.docx
@@ -56,6 +56,8 @@
             </w:r>
             <w:r>
               <w:rPr>
+                <w:b w:val="0"/>
+                <w:i w:val="0"/>
                 <w:sz w:val="21"/>
               </w:rPr>
               <w:t>Kelas 4: Siswa mampu menemukan FPB &amp; KPK dari dua bilangan (≤ 50) menggunakan metode faktor &amp; kelipatan.</w:t>
@@ -63,6 +65,8 @@
             </w:r>
             <w:r>
               <w:rPr>
+                <w:b w:val="0"/>
+                <w:i w:val="0"/>
                 <w:sz w:val="21"/>
               </w:rPr>
               <w:t>Kelas 5: Siswa mampu menentukan FPB &amp; KPK dari dua atau tiga bilangan (≤ 100) menggunakan pohon faktor dan faktorisasi prima.</w:t>
@@ -70,6 +74,8 @@
             </w:r>
             <w:r>
               <w:rPr>
+                <w:b w:val="0"/>
+                <w:i w:val="0"/>
                 <w:sz w:val="21"/>
               </w:rPr>
               <w:t>Kelas 6: Siswa mampu menerapkan KPK &amp; FPB dalam konteks pecahan (penyebut &amp; penyederhanaan) dan masalah kehidupan nyata bertingkat.</w:t>
@@ -87,7 +93,10 @@
       </w:pPr>
       <w:r>
         <w:rPr>
+          <w:b/>
+          <w:i w:val="0"/>
           <w:color w:val="059669"/>
+          <w:sz w:val="28"/>
         </w:rPr>
         <w:t>A. KONSEP DASAR — FPB (Faktor Persekutuan Terbesar)</w:t>
       </w:r>
@@ -95,29 +104,11 @@
     <w:p>
       <w:r>
         <w:rPr>
-          <w:b/>
-          <w:color w:val="0F172A"/>
-          <w:sz w:val="22"/>
-        </w:rPr>
-        <w:t>🔑 Definisi</w:t>
-      </w:r>
-    </w:p>
-    <w:p>
-      <w:r>
-        <w:rPr>
           <w:b w:val="0"/>
+          <w:i w:val="0"/>
           <w:sz w:val="22"/>
         </w:rPr>
         <w:t>Faktor adalah bilangan yang membagi habis suatu bilangan. FPB adalah faktor persekutuan TERBESAR dari dua bilangan atau lebih.</w:t>
-      </w:r>
-    </w:p>
-    <w:p>
-      <w:pPr>
-        <w:pStyle w:val="Heading2"/>
-        <w:jc w:val="left"/>
-      </w:pPr>
-      <w:r>
-        <w:t>Contoh — FPB(12, 18)</w:t>
       </w:r>
     </w:p>
     <w:tbl>
@@ -139,9 +130,14 @@
             <w:shd w:val="clear" w:color="auto" w:fill="D1FAE5"/>
           </w:tcPr>
           <w:p>
+            <w:pPr>
+              <w:jc w:val="center"/>
+            </w:pPr>
             <w:r>
               <w:rPr>
                 <w:b/>
+                <w:i w:val="0"/>
+                <w:sz w:val="20"/>
               </w:rPr>
               <w:t>Bilangan</w:t>
             </w:r>
@@ -153,9 +149,14 @@
             <w:shd w:val="clear" w:color="auto" w:fill="D1FAE5"/>
           </w:tcPr>
           <w:p>
+            <w:pPr>
+              <w:jc w:val="center"/>
+            </w:pPr>
             <w:r>
               <w:rPr>
                 <w:b/>
+                <w:i w:val="0"/>
+                <w:sz w:val="20"/>
               </w:rPr>
               <w:t>Faktor-Faktornya</w:t>
             </w:r>
@@ -167,9 +168,14 @@
             <w:shd w:val="clear" w:color="auto" w:fill="D1FAE5"/>
           </w:tcPr>
           <w:p>
+            <w:pPr>
+              <w:jc w:val="center"/>
+            </w:pPr>
             <w:r>
               <w:rPr>
                 <w:b/>
+                <w:i w:val="0"/>
+                <w:sz w:val="20"/>
               </w:rPr>
               <w:t>Faktor Persekutuan</w:t>
             </w:r>
@@ -181,9 +187,14 @@
             <w:shd w:val="clear" w:color="auto" w:fill="D1FAE5"/>
           </w:tcPr>
           <w:p>
+            <w:pPr>
+              <w:jc w:val="center"/>
+            </w:pPr>
             <w:r>
               <w:rPr>
                 <w:b/>
+                <w:i w:val="0"/>
+                <w:sz w:val="20"/>
               </w:rPr>
               <w:t>FPB</w:t>
             </w:r>
@@ -277,78 +288,30 @@
     </w:tbl>
     <w:p/>
     <w:p>
+      <w:pPr>
+        <w:pStyle w:val="Heading1"/>
+        <w:jc w:val="left"/>
+      </w:pPr>
       <w:r>
         <w:rPr>
           <w:b/>
-          <w:sz w:val="22"/>
+          <w:i w:val="0"/>
+          <w:color w:val="4F46E5"/>
+          <w:sz w:val="28"/>
         </w:rPr>
-        <w:t>📌 Cara Pohon Faktor (Kelas 5 &amp; 6):</w:t>
+        <w:t>B. KONSEP DASAR — KPK (Kelipatan Persekutuan Terkecil)</w:t>
       </w:r>
     </w:p>
     <w:p>
       <w:r>
         <w:rPr>
           <w:b w:val="0"/>
+          <w:i w:val="0"/>
           <w:sz w:val="22"/>
         </w:rPr>
-        <w:t>12 = 2² × 3      18 = 2 × 3²</w:t>
-        <w:br/>
-        <w:t>Ambil faktor prima yang SAMA dengan PANGKAT TERKECIL:</w:t>
-        <w:br/>
-        <w:t>FPB(12, 18) = 2¹ × 3¹ = 6</w:t>
+        <w:t>Kelipatan adalah hasil perkalian suatu bilangan. KPK adalah kelipatan persekutuan TERKECIL dari dua bilangan atau lebih.</w:t>
       </w:r>
     </w:p>
-    <w:tbl>
-      <w:tblPr>
-        <w:tblW w:type="auto" w:w="0"/>
-        <w:jc w:val="left"/>
-        <w:tblLook w:firstColumn="1" w:firstRow="1" w:lastColumn="0" w:lastRow="0" w:noHBand="0" w:noVBand="1" w:val="04A0"/>
-      </w:tblPr>
-      <w:tblGrid>
-        <w:gridCol w:w="9406"/>
-      </w:tblGrid>
-      <w:tr>
-        <w:tc>
-          <w:tcPr>
-            <w:tcW w:type="dxa" w:w="9406"/>
-            <w:shd w:val="clear" w:color="auto" w:fill="D1FAE5"/>
-          </w:tcPr>
-          <w:p>
-            <w:r>
-              <w:rPr>
-                <w:b/>
-                <w:color w:val="047857"/>
-                <w:sz w:val="22"/>
-              </w:rPr>
-              <w:t>💡 Analogi Guru: BERBAGI DONAT (Kelas 4)</w:t>
-              <w:br/>
-            </w:r>
-            <w:r>
-              <w:rPr>
-                <w:sz w:val="21"/>
-              </w:rPr>
-              <w:t>Punya 12 donat cokelat dan 18 donat keju. Mau dibungkus ke dalam kotak parcel.</w:t>
-              <w:br/>
-            </w:r>
-            <w:r>
-              <w:rPr>
-                <w:sz w:val="21"/>
-              </w:rPr>
-              <w:t>Tiap kotak harus isi SAMA BANYAK. Berapa kotak maksimal? → FPB(12,18) = 6 kotak</w:t>
-              <w:br/>
-            </w:r>
-            <w:r>
-              <w:rPr>
-                <w:sz w:val="21"/>
-              </w:rPr>
-              <w:t>Tiap kotak isi: 12÷6 = 2 donat cokelat dan 18÷6 = 3 donat keju. ✔️</w:t>
-              <w:br/>
-            </w:r>
-          </w:p>
-        </w:tc>
-      </w:tr>
-    </w:tbl>
-    <w:p/>
     <w:p>
       <w:pPr>
         <w:pStyle w:val="Heading1"/>
@@ -356,276 +319,10 @@
       </w:pPr>
       <w:r>
         <w:rPr>
-          <w:color w:val="4F46E5"/>
-        </w:rPr>
-        <w:t>B. KONSEP DASAR — KPK (Kelipatan Persekutuan Terkecil)</w:t>
-      </w:r>
-    </w:p>
-    <w:p>
-      <w:r>
-        <w:rPr>
           <w:b/>
-          <w:color w:val="0F172A"/>
-          <w:sz w:val="22"/>
-        </w:rPr>
-        <w:t>🔑 Definisi</w:t>
-      </w:r>
-    </w:p>
-    <w:p>
-      <w:r>
-        <w:rPr>
-          <w:b w:val="0"/>
-          <w:sz w:val="22"/>
-        </w:rPr>
-        <w:t>Kelipatan adalah hasil perkalian suatu bilangan (1x, 2x, 3x, …). KPK adalah kelipatan persekutuan TERKECIL dari dua bilangan atau lebih.</w:t>
-      </w:r>
-    </w:p>
-    <w:p>
-      <w:pPr>
-        <w:pStyle w:val="Heading2"/>
-        <w:jc w:val="left"/>
-      </w:pPr>
-      <w:r>
-        <w:t>Contoh — KPK(4, 6)</w:t>
-      </w:r>
-    </w:p>
-    <w:tbl>
-      <w:tblPr>
-        <w:tblStyle w:val="TableGrid"/>
-        <w:tblW w:type="auto" w:w="0"/>
-        <w:tblLook w:firstColumn="1" w:firstRow="1" w:lastColumn="0" w:lastRow="0" w:noHBand="0" w:noVBand="1" w:val="04A0"/>
-      </w:tblPr>
-      <w:tblGrid>
-        <w:gridCol w:w="2351"/>
-        <w:gridCol w:w="2351"/>
-        <w:gridCol w:w="2351"/>
-        <w:gridCol w:w="2351"/>
-      </w:tblGrid>
-      <w:tr>
-        <w:tc>
-          <w:tcPr>
-            <w:tcW w:type="dxa" w:w="2351"/>
-            <w:shd w:val="clear" w:color="auto" w:fill="EDE9FE"/>
-          </w:tcPr>
-          <w:p>
-            <w:r>
-              <w:rPr>
-                <w:b/>
-              </w:rPr>
-              <w:t>Bilangan</w:t>
-            </w:r>
-          </w:p>
-        </w:tc>
-        <w:tc>
-          <w:tcPr>
-            <w:tcW w:type="dxa" w:w="2351"/>
-            <w:shd w:val="clear" w:color="auto" w:fill="EDE9FE"/>
-          </w:tcPr>
-          <w:p>
-            <w:r>
-              <w:rPr>
-                <w:b/>
-              </w:rPr>
-              <w:t>Kelipatan Pertama (10 bilangan)</w:t>
-            </w:r>
-          </w:p>
-        </w:tc>
-        <w:tc>
-          <w:tcPr>
-            <w:tcW w:type="dxa" w:w="2351"/>
-            <w:shd w:val="clear" w:color="auto" w:fill="EDE9FE"/>
-          </w:tcPr>
-          <w:p>
-            <w:r>
-              <w:rPr>
-                <w:b/>
-              </w:rPr>
-              <w:t>Kelipatan Persekutuan</w:t>
-            </w:r>
-          </w:p>
-        </w:tc>
-        <w:tc>
-          <w:tcPr>
-            <w:tcW w:type="dxa" w:w="2351"/>
-            <w:shd w:val="clear" w:color="auto" w:fill="EDE9FE"/>
-          </w:tcPr>
-          <w:p>
-            <w:r>
-              <w:rPr>
-                <w:b/>
-              </w:rPr>
-              <w:t>KPK</w:t>
-            </w:r>
-          </w:p>
-        </w:tc>
-      </w:tr>
-      <w:tr>
-        <w:tc>
-          <w:tcPr>
-            <w:tcW w:type="dxa" w:w="2351"/>
-          </w:tcPr>
-          <w:p>
-            <w:r>
-              <w:t>4</w:t>
-            </w:r>
-          </w:p>
-        </w:tc>
-        <w:tc>
-          <w:tcPr>
-            <w:tcW w:type="dxa" w:w="2351"/>
-          </w:tcPr>
-          <w:p>
-            <w:r>
-              <w:t>4, 8, 12, 16, 20, 24, 28, 32, 36, 40</w:t>
-            </w:r>
-          </w:p>
-        </w:tc>
-        <w:tc>
-          <w:tcPr>
-            <w:tcW w:type="dxa" w:w="2351"/>
-          </w:tcPr>
-          <w:p>
-            <w:r>
-              <w:t>12, 24, 36 …</w:t>
-            </w:r>
-          </w:p>
-        </w:tc>
-        <w:tc>
-          <w:tcPr>
-            <w:tcW w:type="dxa" w:w="2351"/>
-          </w:tcPr>
-          <w:p>
-            <w:r>
-              <w:t>12</w:t>
-            </w:r>
-          </w:p>
-        </w:tc>
-      </w:tr>
-      <w:tr>
-        <w:tc>
-          <w:tcPr>
-            <w:tcW w:type="dxa" w:w="2351"/>
-          </w:tcPr>
-          <w:p>
-            <w:r>
-              <w:t>6</w:t>
-            </w:r>
-          </w:p>
-        </w:tc>
-        <w:tc>
-          <w:tcPr>
-            <w:tcW w:type="dxa" w:w="2351"/>
-          </w:tcPr>
-          <w:p>
-            <w:r>
-              <w:t>6, 12, 18, 24, 30, 36, 42, 48, 54, 60</w:t>
-            </w:r>
-          </w:p>
-        </w:tc>
-        <w:tc>
-          <w:tcPr>
-            <w:tcW w:type="dxa" w:w="2351"/>
-          </w:tcPr>
-          <w:p>
-            <w:r>
-              <w:t>12, 24, 36 …</w:t>
-            </w:r>
-          </w:p>
-        </w:tc>
-        <w:tc>
-          <w:tcPr>
-            <w:tcW w:type="dxa" w:w="2351"/>
-          </w:tcPr>
-          <w:p>
-            <w:r>
-              <w:t>12</w:t>
-            </w:r>
-          </w:p>
-        </w:tc>
-      </w:tr>
-    </w:tbl>
-    <w:p/>
-    <w:p>
-      <w:r>
-        <w:rPr>
-          <w:b/>
-          <w:sz w:val="22"/>
-        </w:rPr>
-        <w:t>📌 Cara Pohon Faktor (Kelas 5 &amp; 6):</w:t>
-      </w:r>
-    </w:p>
-    <w:p>
-      <w:r>
-        <w:rPr>
-          <w:b w:val="0"/>
-          <w:sz w:val="22"/>
-        </w:rPr>
-        <w:t>4 = 2²      6 = 2 × 3</w:t>
-        <w:br/>
-        <w:t>Ambil faktor prima yang ADA (SEMUA) dengan PANGKAT TERBESAR:</w:t>
-        <w:br/>
-        <w:t>KPK(4, 6) = 2² × 3 = 12</w:t>
-      </w:r>
-    </w:p>
-    <w:tbl>
-      <w:tblPr>
-        <w:tblW w:type="auto" w:w="0"/>
-        <w:jc w:val="left"/>
-        <w:tblLook w:firstColumn="1" w:firstRow="1" w:lastColumn="0" w:lastRow="0" w:noHBand="0" w:noVBand="1" w:val="04A0"/>
-      </w:tblPr>
-      <w:tblGrid>
-        <w:gridCol w:w="9406"/>
-      </w:tblGrid>
-      <w:tr>
-        <w:tc>
-          <w:tcPr>
-            <w:tcW w:type="dxa" w:w="9406"/>
-            <w:shd w:val="clear" w:color="auto" w:fill="EDE9FE"/>
-          </w:tcPr>
-          <w:p>
-            <w:r>
-              <w:rPr>
-                <w:b/>
-                <w:color w:val="047857"/>
-                <w:sz w:val="22"/>
-              </w:rPr>
-              <w:t>💡 Analogi Guru: JADWAL KUNJUNGAN (Kelas 4 &amp; 5)</w:t>
-              <w:br/>
-            </w:r>
-            <w:r>
-              <w:rPr>
-                <w:sz w:val="21"/>
-              </w:rPr>
-              <w:t>Kakak senam lantai setiap 4 hari. Adik renang setiap 6 hari.</w:t>
-              <w:br/>
-            </w:r>
-            <w:r>
-              <w:rPr>
-                <w:sz w:val="21"/>
-              </w:rPr>
-              <w:t>Kapan mereka berolahraga BERSAMA lagi? → KPK(4,6) = 12 hari kemudian.</w:t>
-              <w:br/>
-            </w:r>
-            <w:r>
-              <w:rPr>
-                <w:sz w:val="21"/>
-              </w:rPr>
-              <w:t>Konteks lebih lanjut Kelas 5/6: Lampu merah A berkedip tiap 4 menit, B tiap 6 menit → KPK = 12 menit.</w:t>
-              <w:br/>
-            </w:r>
-          </w:p>
-        </w:tc>
-      </w:tr>
-    </w:tbl>
-    <w:p/>
-    <w:p>
-      <w:pPr>
-        <w:pStyle w:val="Heading1"/>
-        <w:jc w:val="left"/>
-      </w:pPr>
-      <w:r>
-        <w:rPr>
+          <w:i w:val="0"/>
           <w:color w:val="DC2626"/>
+          <w:sz w:val="28"/>
         </w:rPr>
         <w:t>C. CARA CEPAT MEMBEDAKAN FPB vs KPK dari Soal Cerita</w:t>
       </w:r>
@@ -648,9 +345,14 @@
             <w:shd w:val="clear" w:color="auto" w:fill="CBD5E1"/>
           </w:tcPr>
           <w:p>
+            <w:pPr>
+              <w:jc w:val="center"/>
+            </w:pPr>
             <w:r>
               <w:rPr>
                 <w:b/>
+                <w:i w:val="0"/>
+                <w:sz w:val="20"/>
               </w:rPr>
               <w:t>Kata Kunci Soal</w:t>
             </w:r>
@@ -662,9 +364,14 @@
             <w:shd w:val="clear" w:color="auto" w:fill="CBD5E1"/>
           </w:tcPr>
           <w:p>
+            <w:pPr>
+              <w:jc w:val="center"/>
+            </w:pPr>
             <w:r>
               <w:rPr>
                 <w:b/>
+                <w:i w:val="0"/>
+                <w:sz w:val="20"/>
               </w:rPr>
               <w:t>Operasi</w:t>
             </w:r>
@@ -676,9 +383,14 @@
             <w:shd w:val="clear" w:color="auto" w:fill="CBD5E1"/>
           </w:tcPr>
           <w:p>
+            <w:pPr>
+              <w:jc w:val="center"/>
+            </w:pPr>
             <w:r>
               <w:rPr>
                 <w:b/>
+                <w:i w:val="0"/>
+                <w:sz w:val="20"/>
               </w:rPr>
               <w:t>Metode</w:t>
             </w:r>
@@ -692,7 +404,15 @@
             <w:shd w:val="clear" w:color="auto" w:fill="FEE2E2"/>
           </w:tcPr>
           <w:p>
+            <w:pPr>
+              <w:jc w:val="center"/>
+            </w:pPr>
             <w:r>
+              <w:rPr>
+                <w:b w:val="0"/>
+                <w:i w:val="0"/>
+                <w:sz w:val="20"/>
+              </w:rPr>
               <w:t>"dibagi rata", "dibungkus sama banyak", "paling banyak kelompok", "maksimal"</w:t>
             </w:r>
           </w:p>
@@ -703,7 +423,15 @@
             <w:shd w:val="clear" w:color="auto" w:fill="FEE2E2"/>
           </w:tcPr>
           <w:p>
+            <w:pPr>
+              <w:jc w:val="center"/>
+            </w:pPr>
             <w:r>
+              <w:rPr>
+                <w:b w:val="0"/>
+                <w:i w:val="0"/>
+                <w:sz w:val="20"/>
+              </w:rPr>
               <w:t>FPB</w:t>
             </w:r>
           </w:p>
@@ -714,7 +442,15 @@
             <w:shd w:val="clear" w:color="auto" w:fill="FEE2E2"/>
           </w:tcPr>
           <w:p>
+            <w:pPr>
+              <w:jc w:val="center"/>
+            </w:pPr>
             <w:r>
+              <w:rPr>
+                <w:b w:val="0"/>
+                <w:i w:val="0"/>
+                <w:sz w:val="20"/>
+              </w:rPr>
               <w:t>Faktor Persekutuan Terbesar</w:t>
             </w:r>
           </w:p>
@@ -727,7 +463,15 @@
             <w:shd w:val="clear" w:color="auto" w:fill="D1FAE5"/>
           </w:tcPr>
           <w:p>
+            <w:pPr>
+              <w:jc w:val="center"/>
+            </w:pPr>
             <w:r>
+              <w:rPr>
+                <w:b w:val="0"/>
+                <w:i w:val="0"/>
+                <w:sz w:val="20"/>
+              </w:rPr>
               <w:t>"bersama-sama lagi", "bersamaan pertama kali", "hari/jam ke berapa", "paling cepat"</w:t>
             </w:r>
           </w:p>
@@ -738,7 +482,15 @@
             <w:shd w:val="clear" w:color="auto" w:fill="D1FAE5"/>
           </w:tcPr>
           <w:p>
+            <w:pPr>
+              <w:jc w:val="center"/>
+            </w:pPr>
             <w:r>
+              <w:rPr>
+                <w:b w:val="0"/>
+                <w:i w:val="0"/>
+                <w:sz w:val="20"/>
+              </w:rPr>
               <w:t>KPK</w:t>
             </w:r>
           </w:p>
@@ -749,7 +501,15 @@
             <w:shd w:val="clear" w:color="auto" w:fill="D1FAE5"/>
           </w:tcPr>
           <w:p>
+            <w:pPr>
+              <w:jc w:val="center"/>
+            </w:pPr>
             <w:r>
+              <w:rPr>
+                <w:b w:val="0"/>
+                <w:i w:val="0"/>
+                <w:sz w:val="20"/>
+              </w:rPr>
               <w:t>Kelipatan Persekutuan Terkecil</w:t>
             </w:r>
           </w:p>
@@ -762,7 +522,15 @@
             <w:shd w:val="clear" w:color="auto" w:fill="EDE9FE"/>
           </w:tcPr>
           <w:p>
+            <w:pPr>
+              <w:jc w:val="center"/>
+            </w:pPr>
             <w:r>
+              <w:rPr>
+                <w:b w:val="0"/>
+                <w:i w:val="0"/>
+                <w:sz w:val="20"/>
+              </w:rPr>
               <w:t>"menyamakan penyebut pecahan"</w:t>
             </w:r>
           </w:p>
@@ -773,7 +541,15 @@
             <w:shd w:val="clear" w:color="auto" w:fill="EDE9FE"/>
           </w:tcPr>
           <w:p>
+            <w:pPr>
+              <w:jc w:val="center"/>
+            </w:pPr>
             <w:r>
+              <w:rPr>
+                <w:b w:val="0"/>
+                <w:i w:val="0"/>
+                <w:sz w:val="20"/>
+              </w:rPr>
               <w:t>KPK (Kelas 6)</w:t>
             </w:r>
           </w:p>
@@ -784,7 +560,15 @@
             <w:shd w:val="clear" w:color="auto" w:fill="EDE9FE"/>
           </w:tcPr>
           <w:p>
+            <w:pPr>
+              <w:jc w:val="center"/>
+            </w:pPr>
             <w:r>
+              <w:rPr>
+                <w:b w:val="0"/>
+                <w:i w:val="0"/>
+                <w:sz w:val="20"/>
+              </w:rPr>
               <w:t>Pohon faktor, ambil pangkat terbesar</w:t>
             </w:r>
           </w:p>
@@ -799,7 +583,10 @@
       </w:pPr>
       <w:r>
         <w:rPr>
+          <w:b/>
+          <w:i w:val="0"/>
           <w:color w:val="0284C7"/>
+          <w:sz w:val="28"/>
         </w:rPr>
         <w:t>D. APLIKASI KELAS 6 — KPK &amp; FPB dalam Pecahan</w:t>
       </w:r>
@@ -808,6 +595,7 @@
       <w:r>
         <w:rPr>
           <w:b/>
+          <w:i w:val="0"/>
           <w:sz w:val="22"/>
         </w:rPr>
         <w:t>1️⃣ Menyamakan Penyebut (menggunakan KPK)</w:t>
@@ -817,25 +605,377 @@
       <w:r>
         <w:rPr>
           <w:b w:val="0"/>
+          <w:i w:val="0"/>
           <w:sz w:val="22"/>
         </w:rPr>
-        <w:t>Contoh: 1/4 + 1/6 = ?</w:t>
+        <w:t xml:space="preserve">Contoh: </w:t>
+      </w:r>
+      <m:oMath>
+        <m:f>
+          <m:fPr/>
+          <m:num>
+            <m:r>
+              <m:rPr>
+                <w:rFonts w:ascii="Cambria Math" w:hAnsi="Cambria Math"/>
+              </m:rPr>
+              <m:t>1</m:t>
+            </m:r>
+          </m:num>
+          <m:den>
+            <m:r>
+              <m:rPr>
+                <w:rFonts w:ascii="Cambria Math" w:hAnsi="Cambria Math"/>
+              </m:rPr>
+              <m:t>4</m:t>
+            </m:r>
+          </m:den>
+        </m:f>
+      </m:oMath>
+      <w:r>
+        <w:rPr>
+          <w:b w:val="0"/>
+          <w:i w:val="0"/>
+          <w:sz w:val="22"/>
+        </w:rPr>
+        <w:t xml:space="preserve"> + </w:t>
+      </w:r>
+      <m:oMath>
+        <m:f>
+          <m:fPr/>
+          <m:num>
+            <m:r>
+              <m:rPr>
+                <w:rFonts w:ascii="Cambria Math" w:hAnsi="Cambria Math"/>
+              </m:rPr>
+              <m:t>1</m:t>
+            </m:r>
+          </m:num>
+          <m:den>
+            <m:r>
+              <m:rPr>
+                <w:rFonts w:ascii="Cambria Math" w:hAnsi="Cambria Math"/>
+              </m:rPr>
+              <m:t>6</m:t>
+            </m:r>
+          </m:den>
+        </m:f>
+      </m:oMath>
+      <w:r>
+        <w:rPr>
+          <w:b w:val="0"/>
+          <w:i w:val="0"/>
+          <w:sz w:val="22"/>
+        </w:rPr>
+        <w:t xml:space="preserve"> = ?</w:t>
         <w:br/>
         <w:t>→ KPK(4, 6) = 12</w:t>
         <w:br/>
-        <w:t>→ 1/4 = 3/12 dan 1/6 = 2/12</w:t>
+        <w:t xml:space="preserve">→ </w:t>
+      </w:r>
+      <m:oMath>
+        <m:f>
+          <m:fPr/>
+          <m:num>
+            <m:r>
+              <m:rPr>
+                <w:rFonts w:ascii="Cambria Math" w:hAnsi="Cambria Math"/>
+              </m:rPr>
+              <m:t>1</m:t>
+            </m:r>
+          </m:num>
+          <m:den>
+            <m:r>
+              <m:rPr>
+                <w:rFonts w:ascii="Cambria Math" w:hAnsi="Cambria Math"/>
+              </m:rPr>
+              <m:t>4</m:t>
+            </m:r>
+          </m:den>
+        </m:f>
+      </m:oMath>
+      <w:r>
+        <w:rPr>
+          <w:b w:val="0"/>
+          <w:i w:val="0"/>
+          <w:sz w:val="22"/>
+        </w:rPr>
+        <w:t xml:space="preserve"> = </w:t>
+      </w:r>
+      <m:oMath>
+        <m:f>
+          <m:fPr/>
+          <m:num>
+            <m:r>
+              <m:rPr>
+                <w:rFonts w:ascii="Cambria Math" w:hAnsi="Cambria Math"/>
+              </m:rPr>
+              <m:t>3</m:t>
+            </m:r>
+          </m:num>
+          <m:den>
+            <m:r>
+              <m:rPr>
+                <w:rFonts w:ascii="Cambria Math" w:hAnsi="Cambria Math"/>
+              </m:rPr>
+              <m:t>12</m:t>
+            </m:r>
+          </m:den>
+        </m:f>
+      </m:oMath>
+      <w:r>
+        <w:rPr>
+          <w:b w:val="0"/>
+          <w:i w:val="0"/>
+          <w:sz w:val="22"/>
+        </w:rPr>
+        <w:t xml:space="preserve"> dan </w:t>
+      </w:r>
+      <m:oMath>
+        <m:f>
+          <m:fPr/>
+          <m:num>
+            <m:r>
+              <m:rPr>
+                <w:rFonts w:ascii="Cambria Math" w:hAnsi="Cambria Math"/>
+              </m:rPr>
+              <m:t>1</m:t>
+            </m:r>
+          </m:num>
+          <m:den>
+            <m:r>
+              <m:rPr>
+                <w:rFonts w:ascii="Cambria Math" w:hAnsi="Cambria Math"/>
+              </m:rPr>
+              <m:t>6</m:t>
+            </m:r>
+          </m:den>
+        </m:f>
+      </m:oMath>
+      <w:r>
+        <w:rPr>
+          <w:b w:val="0"/>
+          <w:i w:val="0"/>
+          <w:sz w:val="22"/>
+        </w:rPr>
+        <w:t xml:space="preserve"> = </w:t>
+      </w:r>
+      <m:oMath>
+        <m:f>
+          <m:fPr/>
+          <m:num>
+            <m:r>
+              <m:rPr>
+                <w:rFonts w:ascii="Cambria Math" w:hAnsi="Cambria Math"/>
+              </m:rPr>
+              <m:t>2</m:t>
+            </m:r>
+          </m:num>
+          <m:den>
+            <m:r>
+              <m:rPr>
+                <w:rFonts w:ascii="Cambria Math" w:hAnsi="Cambria Math"/>
+              </m:rPr>
+              <m:t>12</m:t>
+            </m:r>
+          </m:den>
+        </m:f>
+      </m:oMath>
+      <w:r>
+        <w:rPr>
+          <w:b w:val="0"/>
+          <w:i w:val="0"/>
+          <w:sz w:val="22"/>
+        </w:rPr>
         <w:br/>
-        <w:t>→ 3/12 + 2/12 = 5/12  ✔️</w:t>
+        <w:t xml:space="preserve">→ </w:t>
+      </w:r>
+      <m:oMath>
+        <m:f>
+          <m:fPr/>
+          <m:num>
+            <m:r>
+              <m:rPr>
+                <w:rFonts w:ascii="Cambria Math" w:hAnsi="Cambria Math"/>
+              </m:rPr>
+              <m:t>3</m:t>
+            </m:r>
+          </m:num>
+          <m:den>
+            <m:r>
+              <m:rPr>
+                <w:rFonts w:ascii="Cambria Math" w:hAnsi="Cambria Math"/>
+              </m:rPr>
+              <m:t>12</m:t>
+            </m:r>
+          </m:den>
+        </m:f>
+      </m:oMath>
+      <w:r>
+        <w:rPr>
+          <w:b w:val="0"/>
+          <w:i w:val="0"/>
+          <w:sz w:val="22"/>
+        </w:rPr>
+        <w:t xml:space="preserve"> + </w:t>
+      </w:r>
+      <m:oMath>
+        <m:f>
+          <m:fPr/>
+          <m:num>
+            <m:r>
+              <m:rPr>
+                <w:rFonts w:ascii="Cambria Math" w:hAnsi="Cambria Math"/>
+              </m:rPr>
+              <m:t>2</m:t>
+            </m:r>
+          </m:num>
+          <m:den>
+            <m:r>
+              <m:rPr>
+                <w:rFonts w:ascii="Cambria Math" w:hAnsi="Cambria Math"/>
+              </m:rPr>
+              <m:t>12</m:t>
+            </m:r>
+          </m:den>
+        </m:f>
+      </m:oMath>
+      <w:r>
+        <w:rPr>
+          <w:b w:val="0"/>
+          <w:i w:val="0"/>
+          <w:sz w:val="22"/>
+        </w:rPr>
+        <w:t xml:space="preserve"> = </w:t>
+      </w:r>
+      <m:oMath>
+        <m:f>
+          <m:fPr/>
+          <m:num>
+            <m:r>
+              <m:rPr>
+                <w:rFonts w:ascii="Cambria Math" w:hAnsi="Cambria Math"/>
+              </m:rPr>
+              <m:t>5</m:t>
+            </m:r>
+          </m:num>
+          <m:den>
+            <m:r>
+              <m:rPr>
+                <w:rFonts w:ascii="Cambria Math" w:hAnsi="Cambria Math"/>
+              </m:rPr>
+              <m:t>12</m:t>
+            </m:r>
+          </m:den>
+        </m:f>
+      </m:oMath>
+      <w:r>
+        <w:rPr>
+          <w:b w:val="0"/>
+          <w:i w:val="0"/>
+          <w:sz w:val="22"/>
+        </w:rPr>
+        <w:t xml:space="preserve">  ✔️</w:t>
       </w:r>
     </w:p>
     <w:p>
       <w:r>
         <w:rPr>
           <w:b w:val="0"/>
+          <w:i w:val="0"/>
           <w:color w:val="DC2626"/>
           <w:sz w:val="22"/>
         </w:rPr>
-        <w:t>⚠️ Kesalahan Umum: 1/4 + 1/6 ≠ 2/10 (SALAH! Penyebut tidak dijumlahkan!)</w:t>
+        <w:t xml:space="preserve">⚠️ Kesalahan Umum: </w:t>
+      </w:r>
+      <m:oMath>
+        <m:f>
+          <m:fPr/>
+          <m:num>
+            <m:r>
+              <m:rPr>
+                <w:rFonts w:ascii="Cambria Math" w:hAnsi="Cambria Math"/>
+              </m:rPr>
+              <m:t>1</m:t>
+            </m:r>
+          </m:num>
+          <m:den>
+            <m:r>
+              <m:rPr>
+                <w:rFonts w:ascii="Cambria Math" w:hAnsi="Cambria Math"/>
+              </m:rPr>
+              <m:t>4</m:t>
+            </m:r>
+          </m:den>
+        </m:f>
+      </m:oMath>
+      <w:r>
+        <w:rPr>
+          <w:b w:val="0"/>
+          <w:i w:val="0"/>
+          <w:color w:val="DC2626"/>
+          <w:sz w:val="22"/>
+        </w:rPr>
+        <w:t xml:space="preserve"> + </w:t>
+      </w:r>
+      <m:oMath>
+        <m:f>
+          <m:fPr/>
+          <m:num>
+            <m:r>
+              <m:rPr>
+                <w:rFonts w:ascii="Cambria Math" w:hAnsi="Cambria Math"/>
+              </m:rPr>
+              <m:t>1</m:t>
+            </m:r>
+          </m:num>
+          <m:den>
+            <m:r>
+              <m:rPr>
+                <w:rFonts w:ascii="Cambria Math" w:hAnsi="Cambria Math"/>
+              </m:rPr>
+              <m:t>6</m:t>
+            </m:r>
+          </m:den>
+        </m:f>
+      </m:oMath>
+      <w:r>
+        <w:rPr>
+          <w:b w:val="0"/>
+          <w:i w:val="0"/>
+          <w:color w:val="DC2626"/>
+          <w:sz w:val="22"/>
+        </w:rPr>
+        <w:t xml:space="preserve"> ≠ </w:t>
+      </w:r>
+      <m:oMath>
+        <m:f>
+          <m:fPr/>
+          <m:num>
+            <m:r>
+              <m:rPr>
+                <w:rFonts w:ascii="Cambria Math" w:hAnsi="Cambria Math"/>
+              </m:rPr>
+              <m:t>2</m:t>
+            </m:r>
+          </m:num>
+          <m:den>
+            <m:r>
+              <m:rPr>
+                <w:rFonts w:ascii="Cambria Math" w:hAnsi="Cambria Math"/>
+              </m:rPr>
+              <m:t>10</m:t>
+            </m:r>
+          </m:den>
+        </m:f>
+      </m:oMath>
+      <w:r>
+        <w:rPr>
+          <w:b w:val="0"/>
+          <w:i w:val="0"/>
+          <w:color w:val="DC2626"/>
+          <w:sz w:val="22"/>
+        </w:rPr>
+        <w:t xml:space="preserve"> (SALAH! Penyebut tidak dijumlahkan!)</w:t>
       </w:r>
     </w:p>
     <w:p/>
@@ -843,6 +983,7 @@
       <w:r>
         <w:rPr>
           <w:b/>
+          <w:i w:val="0"/>
           <w:sz w:val="22"/>
         </w:rPr>
         <w:t>2️⃣ Menyederhanakan Pecahan (menggunakan FPB)</w:t>
@@ -852,13 +993,100 @@
       <w:r>
         <w:rPr>
           <w:b w:val="0"/>
+          <w:i w:val="0"/>
           <w:sz w:val="22"/>
         </w:rPr>
-        <w:t>Contoh: Sederhanakan 12/18</w:t>
+        <w:t xml:space="preserve">Contoh: Sederhanakan </w:t>
+      </w:r>
+      <m:oMath>
+        <m:f>
+          <m:fPr/>
+          <m:num>
+            <m:r>
+              <m:rPr>
+                <w:rFonts w:ascii="Cambria Math" w:hAnsi="Cambria Math"/>
+              </m:rPr>
+              <m:t>12</m:t>
+            </m:r>
+          </m:num>
+          <m:den>
+            <m:r>
+              <m:rPr>
+                <w:rFonts w:ascii="Cambria Math" w:hAnsi="Cambria Math"/>
+              </m:rPr>
+              <m:t>18</m:t>
+            </m:r>
+          </m:den>
+        </m:f>
+      </m:oMath>
+      <w:r>
+        <w:rPr>
+          <w:b w:val="0"/>
+          <w:i w:val="0"/>
+          <w:sz w:val="22"/>
+        </w:rPr>
         <w:br/>
         <w:t>→ FPB(12, 18) = 6</w:t>
         <w:br/>
-        <w:t>→ 12÷6 / 18÷6 = 2/3  ✔️</w:t>
+        <w:t xml:space="preserve">→ </w:t>
+      </w:r>
+      <m:oMath>
+        <m:f>
+          <m:fPr/>
+          <m:num>
+            <m:r>
+              <m:rPr>
+                <w:rFonts w:ascii="Cambria Math" w:hAnsi="Cambria Math"/>
+              </m:rPr>
+              <m:t>12÷6</m:t>
+            </m:r>
+          </m:num>
+          <m:den>
+            <m:r>
+              <m:rPr>
+                <w:rFonts w:ascii="Cambria Math" w:hAnsi="Cambria Math"/>
+              </m:rPr>
+              <m:t>18÷6</m:t>
+            </m:r>
+          </m:den>
+        </m:f>
+      </m:oMath>
+      <w:r>
+        <w:rPr>
+          <w:b w:val="0"/>
+          <w:i w:val="0"/>
+          <w:sz w:val="22"/>
+        </w:rPr>
+        <w:t xml:space="preserve"> = </w:t>
+      </w:r>
+      <m:oMath>
+        <m:f>
+          <m:fPr/>
+          <m:num>
+            <m:r>
+              <m:rPr>
+                <w:rFonts w:ascii="Cambria Math" w:hAnsi="Cambria Math"/>
+              </m:rPr>
+              <m:t>2</m:t>
+            </m:r>
+          </m:num>
+          <m:den>
+            <m:r>
+              <m:rPr>
+                <w:rFonts w:ascii="Cambria Math" w:hAnsi="Cambria Math"/>
+              </m:rPr>
+              <m:t>3</m:t>
+            </m:r>
+          </m:den>
+        </m:f>
+      </m:oMath>
+      <w:r>
+        <w:rPr>
+          <w:b w:val="0"/>
+          <w:i w:val="0"/>
+          <w:sz w:val="22"/>
+        </w:rPr>
+        <w:t xml:space="preserve">  ✔️</w:t>
       </w:r>
     </w:p>
     <w:tbl>
@@ -888,250 +1116,225 @@
             </w:r>
             <w:r>
               <w:rPr>
+                <w:b w:val="0"/>
+                <w:i w:val="0"/>
                 <w:sz w:val="21"/>
               </w:rPr>
-              <w:t>Pizza keju dipotong 4 bagian (1 potong = 1/4). Pizza sosis dipotong 6 bagian (1 potong = 1/6).</w:t>
+              <w:t xml:space="preserve">Pizza keju dipotong 4 bagian (1 potong = </w:t>
+            </w:r>
+            <m:oMath>
+              <m:f>
+                <m:fPr/>
+                <m:num>
+                  <m:r>
+                    <m:rPr>
+                      <w:rFonts w:ascii="Cambria Math" w:hAnsi="Cambria Math"/>
+                    </m:rPr>
+                    <m:t>1</m:t>
+                  </m:r>
+                </m:num>
+                <m:den>
+                  <m:r>
+                    <m:rPr>
+                      <w:rFonts w:ascii="Cambria Math" w:hAnsi="Cambria Math"/>
+                    </m:rPr>
+                    <m:t>4</m:t>
+                  </m:r>
+                </m:den>
+              </m:f>
+            </m:oMath>
+            <w:r>
+              <w:rPr>
+                <w:b w:val="0"/>
+                <w:i w:val="0"/>
+                <w:sz w:val="21"/>
+              </w:rPr>
+              <w:t xml:space="preserve">). Pizza sosis dipotong 6 bagian (1 potong = </w:t>
+            </w:r>
+            <m:oMath>
+              <m:f>
+                <m:fPr/>
+                <m:num>
+                  <m:r>
+                    <m:rPr>
+                      <w:rFonts w:ascii="Cambria Math" w:hAnsi="Cambria Math"/>
+                    </m:rPr>
+                    <m:t>1</m:t>
+                  </m:r>
+                </m:num>
+                <m:den>
+                  <m:r>
+                    <m:rPr>
+                      <w:rFonts w:ascii="Cambria Math" w:hAnsi="Cambria Math"/>
+                    </m:rPr>
+                    <m:t>6</m:t>
+                  </m:r>
+                </m:den>
+              </m:f>
+            </m:oMath>
+            <w:r>
+              <w:rPr>
+                <w:b w:val="0"/>
+                <w:i w:val="0"/>
+                <w:sz w:val="21"/>
+              </w:rPr>
+              <w:t>).</w:t>
               <w:br/>
             </w:r>
             <w:r>
               <w:rPr>
+                <w:b w:val="0"/>
+                <w:i w:val="0"/>
                 <w:sz w:val="21"/>
               </w:rPr>
               <w:t>Jika mau dijumlah, harus disamakan dulu ukurannya! KPK(4,6)=12 → semua dipotong jadi 12 bagian.</w:t>
               <w:br/>
             </w:r>
+            <m:oMath>
+              <m:f>
+                <m:fPr/>
+                <m:num>
+                  <m:r>
+                    <m:rPr>
+                      <w:rFonts w:ascii="Cambria Math" w:hAnsi="Cambria Math"/>
+                    </m:rPr>
+                    <m:t>1</m:t>
+                  </m:r>
+                </m:num>
+                <m:den>
+                  <m:r>
+                    <m:rPr>
+                      <w:rFonts w:ascii="Cambria Math" w:hAnsi="Cambria Math"/>
+                    </m:rPr>
+                    <m:t>4</m:t>
+                  </m:r>
+                </m:den>
+              </m:f>
+            </m:oMath>
             <w:r>
               <w:rPr>
+                <w:b w:val="0"/>
+                <w:i w:val="0"/>
                 <w:sz w:val="21"/>
               </w:rPr>
-              <w:t>1/4 = 3/12 dan 1/6 = 2/12 → total = 5/12 piza dimakan.</w:t>
-              <w:br/>
+              <w:t xml:space="preserve"> = </w:t>
             </w:r>
-          </w:p>
-        </w:tc>
-      </w:tr>
-    </w:tbl>
-    <w:p/>
-    <w:p>
-      <w:pPr>
-        <w:pStyle w:val="Heading1"/>
-        <w:jc w:val="left"/>
-      </w:pPr>
-      <w:r>
-        <w:rPr>
-          <w:color w:val="0F172A"/>
-        </w:rPr>
-        <w:t>E. RINGKASAN METODE &amp; TARGET PER KELAS</w:t>
-      </w:r>
-    </w:p>
-    <w:tbl>
-      <w:tblPr>
-        <w:tblStyle w:val="TableGrid"/>
-        <w:tblW w:type="auto" w:w="0"/>
-        <w:tblLook w:firstColumn="1" w:firstRow="1" w:lastColumn="0" w:lastRow="0" w:noHBand="0" w:noVBand="1" w:val="04A0"/>
-      </w:tblPr>
-      <w:tblGrid>
-        <w:gridCol w:w="2351"/>
-        <w:gridCol w:w="2351"/>
-        <w:gridCol w:w="2351"/>
-        <w:gridCol w:w="2351"/>
-      </w:tblGrid>
-      <w:tr>
-        <w:tc>
-          <w:tcPr>
-            <w:tcW w:type="dxa" w:w="2351"/>
-            <w:shd w:val="clear" w:color="auto" w:fill="1E3A5F"/>
-          </w:tcPr>
-          <w:p>
+            <m:oMath>
+              <m:f>
+                <m:fPr/>
+                <m:num>
+                  <m:r>
+                    <m:rPr>
+                      <w:rFonts w:ascii="Cambria Math" w:hAnsi="Cambria Math"/>
+                    </m:rPr>
+                    <m:t>3</m:t>
+                  </m:r>
+                </m:num>
+                <m:den>
+                  <m:r>
+                    <m:rPr>
+                      <w:rFonts w:ascii="Cambria Math" w:hAnsi="Cambria Math"/>
+                    </m:rPr>
+                    <m:t>12</m:t>
+                  </m:r>
+                </m:den>
+              </m:f>
+            </m:oMath>
             <w:r>
               <w:rPr>
-                <w:b/>
-                <w:color w:val="FFFFFF"/>
+                <w:b w:val="0"/>
+                <w:i w:val="0"/>
+                <w:sz w:val="21"/>
               </w:rPr>
-              <w:t>Kelas</w:t>
+              <w:t xml:space="preserve"> dan </w:t>
             </w:r>
-          </w:p>
-        </w:tc>
-        <w:tc>
-          <w:tcPr>
-            <w:tcW w:type="dxa" w:w="2351"/>
-            <w:shd w:val="clear" w:color="auto" w:fill="1E3A5F"/>
-          </w:tcPr>
-          <w:p>
+            <m:oMath>
+              <m:f>
+                <m:fPr/>
+                <m:num>
+                  <m:r>
+                    <m:rPr>
+                      <w:rFonts w:ascii="Cambria Math" w:hAnsi="Cambria Math"/>
+                    </m:rPr>
+                    <m:t>1</m:t>
+                  </m:r>
+                </m:num>
+                <m:den>
+                  <m:r>
+                    <m:rPr>
+                      <w:rFonts w:ascii="Cambria Math" w:hAnsi="Cambria Math"/>
+                    </m:rPr>
+                    <m:t>6</m:t>
+                  </m:r>
+                </m:den>
+              </m:f>
+            </m:oMath>
             <w:r>
               <w:rPr>
-                <w:b/>
-                <w:color w:val="FFFFFF"/>
+                <w:b w:val="0"/>
+                <w:i w:val="0"/>
+                <w:sz w:val="21"/>
               </w:rPr>
-              <w:t>Metode Utama</w:t>
+              <w:t xml:space="preserve"> = </w:t>
             </w:r>
-          </w:p>
-        </w:tc>
-        <w:tc>
-          <w:tcPr>
-            <w:tcW w:type="dxa" w:w="2351"/>
-            <w:shd w:val="clear" w:color="auto" w:fill="1E3A5F"/>
-          </w:tcPr>
-          <w:p>
+            <m:oMath>
+              <m:f>
+                <m:fPr/>
+                <m:num>
+                  <m:r>
+                    <m:rPr>
+                      <w:rFonts w:ascii="Cambria Math" w:hAnsi="Cambria Math"/>
+                    </m:rPr>
+                    <m:t>2</m:t>
+                  </m:r>
+                </m:num>
+                <m:den>
+                  <m:r>
+                    <m:rPr>
+                      <w:rFonts w:ascii="Cambria Math" w:hAnsi="Cambria Math"/>
+                    </m:rPr>
+                    <m:t>12</m:t>
+                  </m:r>
+                </m:den>
+              </m:f>
+            </m:oMath>
             <w:r>
               <w:rPr>
-                <w:b/>
-                <w:color w:val="FFFFFF"/>
+                <w:b w:val="0"/>
+                <w:i w:val="0"/>
+                <w:sz w:val="21"/>
               </w:rPr>
-              <w:t>Bilangan</w:t>
+              <w:t xml:space="preserve"> → total = </w:t>
             </w:r>
-          </w:p>
-        </w:tc>
-        <w:tc>
-          <w:tcPr>
-            <w:tcW w:type="dxa" w:w="2351"/>
-            <w:shd w:val="clear" w:color="auto" w:fill="1E3A5F"/>
-          </w:tcPr>
-          <w:p>
+            <m:oMath>
+              <m:f>
+                <m:fPr/>
+                <m:num>
+                  <m:r>
+                    <m:rPr>
+                      <w:rFonts w:ascii="Cambria Math" w:hAnsi="Cambria Math"/>
+                    </m:rPr>
+                    <m:t>5</m:t>
+                  </m:r>
+                </m:num>
+                <m:den>
+                  <m:r>
+                    <m:rPr>
+                      <w:rFonts w:ascii="Cambria Math" w:hAnsi="Cambria Math"/>
+                    </m:rPr>
+                    <m:t>12</m:t>
+                  </m:r>
+                </m:den>
+              </m:f>
+            </m:oMath>
             <w:r>
               <w:rPr>
-                <w:b/>
-                <w:color w:val="FFFFFF"/>
+                <w:b w:val="0"/>
+                <w:i w:val="0"/>
+                <w:sz w:val="21"/>
               </w:rPr>
-              <w:t>Konteks Soal</w:t>
-            </w:r>
-          </w:p>
-        </w:tc>
-      </w:tr>
-      <w:tr>
-        <w:tc>
-          <w:tcPr>
-            <w:tcW w:type="dxa" w:w="2351"/>
-            <w:shd w:val="clear" w:color="auto" w:fill="DBEAFE"/>
-          </w:tcPr>
-          <w:p>
-            <w:r>
-              <w:t>4</w:t>
-            </w:r>
-          </w:p>
-        </w:tc>
-        <w:tc>
-          <w:tcPr>
-            <w:tcW w:type="dxa" w:w="2351"/>
-            <w:shd w:val="clear" w:color="auto" w:fill="DBEAFE"/>
-          </w:tcPr>
-          <w:p>
-            <w:r>
-              <w:t>Daftar faktor/kelipatan langsung; pohon faktor sederhana (2 bilangan)</w:t>
-            </w:r>
-          </w:p>
-        </w:tc>
-        <w:tc>
-          <w:tcPr>
-            <w:tcW w:type="dxa" w:w="2351"/>
-            <w:shd w:val="clear" w:color="auto" w:fill="DBEAFE"/>
-          </w:tcPr>
-          <w:p>
-            <w:r>
-              <w:t>≤ 50</w:t>
-            </w:r>
-          </w:p>
-        </w:tc>
-        <w:tc>
-          <w:tcPr>
-            <w:tcW w:type="dxa" w:w="2351"/>
-            <w:shd w:val="clear" w:color="auto" w:fill="DBEAFE"/>
-          </w:tcPr>
-          <w:p>
-            <w:r>
-              <w:t>Donat parcel, jadwal senam bersama</w:t>
-            </w:r>
-          </w:p>
-        </w:tc>
-      </w:tr>
-      <w:tr>
-        <w:tc>
-          <w:tcPr>
-            <w:tcW w:type="dxa" w:w="2351"/>
-            <w:shd w:val="clear" w:color="auto" w:fill="D1FAE5"/>
-          </w:tcPr>
-          <w:p>
-            <w:r>
-              <w:t>5</w:t>
-            </w:r>
-          </w:p>
-        </w:tc>
-        <w:tc>
-          <w:tcPr>
-            <w:tcW w:type="dxa" w:w="2351"/>
-            <w:shd w:val="clear" w:color="auto" w:fill="D1FAE5"/>
-          </w:tcPr>
-          <w:p>
-            <w:r>
-              <w:t>Pohon faktor, faktorisasi prima (2–3 bilangan)</w:t>
-            </w:r>
-          </w:p>
-        </w:tc>
-        <w:tc>
-          <w:tcPr>
-            <w:tcW w:type="dxa" w:w="2351"/>
-            <w:shd w:val="clear" w:color="auto" w:fill="D1FAE5"/>
-          </w:tcPr>
-          <w:p>
-            <w:r>
-              <w:t>≤ 100</w:t>
-            </w:r>
-          </w:p>
-        </w:tc>
-        <w:tc>
-          <w:tcPr>
-            <w:tcW w:type="dxa" w:w="2351"/>
-            <w:shd w:val="clear" w:color="auto" w:fill="D1FAE5"/>
-          </w:tcPr>
-          <w:p>
-            <w:r>
-              <w:t>Jadwal lampu, distribusi barang, soal cerita bertingkat</w:t>
-            </w:r>
-          </w:p>
-        </w:tc>
-      </w:tr>
-      <w:tr>
-        <w:tc>
-          <w:tcPr>
-            <w:tcW w:type="dxa" w:w="2351"/>
-            <w:shd w:val="clear" w:color="auto" w:fill="FEF3C7"/>
-          </w:tcPr>
-          <w:p>
-            <w:r>
-              <w:t>6</w:t>
-            </w:r>
-          </w:p>
-        </w:tc>
-        <w:tc>
-          <w:tcPr>
-            <w:tcW w:type="dxa" w:w="2351"/>
-            <w:shd w:val="clear" w:color="auto" w:fill="FEF3C7"/>
-          </w:tcPr>
-          <w:p>
-            <w:r>
-              <w:t>Faktorisasi prima + aplikasi pecahan</w:t>
-            </w:r>
-          </w:p>
-        </w:tc>
-        <w:tc>
-          <w:tcPr>
-            <w:tcW w:type="dxa" w:w="2351"/>
-            <w:shd w:val="clear" w:color="auto" w:fill="FEF3C7"/>
-          </w:tcPr>
-          <w:p>
-            <w:r>
-              <w:t>≤ 100+</w:t>
-            </w:r>
-          </w:p>
-        </w:tc>
-        <w:tc>
-          <w:tcPr>
-            <w:tcW w:type="dxa" w:w="2351"/>
-            <w:shd w:val="clear" w:color="auto" w:fill="FEF3C7"/>
-          </w:tcPr>
-          <w:p>
-            <w:r>
-              <w:t>Penjumlahan/pengurangan pecahan berbeda penyebut, penyederhanaan</w:t>
+              <w:t xml:space="preserve"> pizza dimakan.</w:t>
+              <w:br/>
             </w:r>
           </w:p>
         </w:tc>

</xml_diff>